<commit_message>
Letterhead (Pages): use one image for logo, contact block and gold rule
Pages dropped the header table layout and the empty-paragraph border, so
the contact info didn't sit as a block and the gold line was missing.

Co-Authored-By: Claude Opus 5.5 <noreply@anthropic.com>
Claude-Session: https://claude.ai/code/session_012i8wR9qeLtNBrvBzFpQnCL
</commit_message>
<xml_diff>
--- a/print/letterhead/thomack-letterhead-pages.docx
+++ b/print/letterhead/thomack-letterhead-pages.docx
@@ -2,167 +2,50 @@
 <file path=word/document.xml><?xml version="1.0" encoding="utf-8"?>
 <w:document xmlns:wpc="http://schemas.microsoft.com/office/word/2010/wordprocessingCanvas" xmlns:mc="http://schemas.openxmlformats.org/markup-compatibility/2006" xmlns:o="urn:schemas-microsoft-com:office:office" xmlns:r="http://schemas.openxmlformats.org/officeDocument/2006/relationships" xmlns:m="http://schemas.openxmlformats.org/officeDocument/2006/math" xmlns:v="urn:schemas-microsoft-com:vml" xmlns:wp14="http://schemas.microsoft.com/office/word/2010/wordprocessingDrawing" xmlns:wp="http://schemas.openxmlformats.org/drawingml/2006/wordprocessingDrawing" xmlns:w10="urn:schemas-microsoft-com:office:word" xmlns:w="http://schemas.openxmlformats.org/wordprocessingml/2006/main" xmlns:w14="http://schemas.microsoft.com/office/word/2010/wordml" xmlns:w15="http://schemas.microsoft.com/office/word/2012/wordml" xmlns:wpg="http://schemas.microsoft.com/office/word/2010/wordprocessingGroup" xmlns:wpi="http://schemas.microsoft.com/office/word/2010/wordprocessingInk" xmlns:wne="http://schemas.microsoft.com/office/word/2006/wordml" xmlns:wps="http://schemas.microsoft.com/office/word/2010/wordprocessingShape" xmlns:cx="http://schemas.microsoft.com/office/drawing/2014/chartex" xmlns:cx1="http://schemas.microsoft.com/office/drawing/2015/9/8/chartex" xmlns:cx2="http://schemas.microsoft.com/office/drawing/2015/10/21/chartex" xmlns:cx3="http://schemas.microsoft.com/office/drawing/2016/5/9/chartex" xmlns:cx4="http://schemas.microsoft.com/office/drawing/2016/5/10/chartex" xmlns:cx5="http://schemas.microsoft.com/office/drawing/2016/5/11/chartex" xmlns:cx6="http://schemas.microsoft.com/office/drawing/2016/5/12/chartex" xmlns:cx7="http://schemas.microsoft.com/office/drawing/2016/5/13/chartex" xmlns:cx8="http://schemas.microsoft.com/office/drawing/2016/5/14/chartex" xmlns:aink="http://schemas.microsoft.com/office/drawing/2016/ink" xmlns:am3d="http://schemas.microsoft.com/office/drawing/2017/model3d" xmlns:w16cex="http://schemas.microsoft.com/office/word/2018/wordml/cex" xmlns:w16cid="http://schemas.microsoft.com/office/word/2016/wordml/cid" xmlns:w16="http://schemas.microsoft.com/office/word/2018/wordml" xmlns:w16sdtdh="http://schemas.microsoft.com/office/word/2020/wordml/sdtdatahash" xmlns:w16se="http://schemas.microsoft.com/office/word/2015/wordml/symex" mc:Ignorable="w14 w15 wp14">
   <w:body>
-    <w:tbl>
-      <w:tblPr>
-        <w:tblW w:type="dxa" w:w="9360"/>
-        <w:tblBorders>
-          <w:top w:val="none" w:color="FFFFFF" w:sz="0"/>
-          <w:left w:val="none" w:color="FFFFFF" w:sz="0"/>
-          <w:bottom w:val="none" w:color="FFFFFF" w:sz="0"/>
-          <w:right w:val="none" w:color="FFFFFF" w:sz="0"/>
-          <w:insideH w:val="none" w:color="FFFFFF" w:sz="0"/>
-          <w:insideV w:val="none" w:color="FFFFFF" w:sz="0"/>
-        </w:tblBorders>
-      </w:tblPr>
-      <w:tblGrid>
-        <w:gridCol w:w="5832"/>
-        <w:gridCol w:w="3528"/>
-      </w:tblGrid>
-      <w:tr>
-        <w:tc>
-          <w:tcPr>
-            <w:tcW w:type="dxa" w:w="5832"/>
-            <w:tcBorders>
-              <w:top w:val="none" w:color="FFFFFF" w:sz="0"/>
-              <w:left w:val="none" w:color="FFFFFF" w:sz="0"/>
-              <w:bottom w:val="none" w:color="FFFFFF" w:sz="0"/>
-              <w:right w:val="none" w:color="FFFFFF" w:sz="0"/>
-            </w:tcBorders>
-            <w:tcMar>
-              <w:left w:type="dxa" w:w="0"/>
-              <w:right w:type="dxa" w:w="0"/>
-            </w:tcMar>
-            <w:vAlign w:val="bottom"/>
-          </w:tcPr>
-          <w:p>
-            <w:pPr>
-              <w:spacing w:after="0" w:before="0" w:line="240" w:lineRule="auto"/>
-            </w:pPr>
-            <w:r>
-              <w:drawing>
-                <wp:inline distT="0" distB="0" distL="0" distR="0">
-                  <wp:extent cx="2476500" cy="485775"/>
-                  <wp:effectExtent t="0" r="0" b="0" l="0"/>
-                  <wp:docPr id="1" name="logo" descr="Thomack Legal Nurse Consulting logo" title="Thomack Legal Nurse Consulting"/>
-                  <wp:cNvGraphicFramePr>
-                    <a:graphicFrameLocks xmlns:a="http://schemas.openxmlformats.org/drawingml/2006/main" noChangeAspect="1"/>
-                  </wp:cNvGraphicFramePr>
-                  <a:graphic xmlns:a="http://schemas.openxmlformats.org/drawingml/2006/main">
-                    <a:graphicData uri="http://schemas.openxmlformats.org/drawingml/2006/picture">
-                      <pic:pic xmlns:pic="http://schemas.openxmlformats.org/drawingml/2006/picture">
-                        <pic:nvPicPr>
-                          <pic:cNvPr id="0" name="" descr=""/>
-                          <pic:cNvPicPr>
-                            <a:picLocks noChangeAspect="1" noChangeArrowheads="1"/>
-                          </pic:cNvPicPr>
-                        </pic:nvPicPr>
-                        <pic:blipFill>
-                          <a:blip r:embed="rId9" cstate="none"/>
-                          <a:srcRect/>
-                          <a:stretch>
-                            <a:fillRect/>
-                          </a:stretch>
-                        </pic:blipFill>
-                        <pic:spPr bwMode="auto">
-                          <a:xfrm>
-                            <a:off x="0" y="0"/>
-                            <a:ext cx="2476500" cy="485775"/>
-                          </a:xfrm>
-                          <a:prstGeom prst="rect">
-                            <a:avLst/>
-                          </a:prstGeom>
-                        </pic:spPr>
-                      </pic:pic>
-                    </a:graphicData>
-                  </a:graphic>
-                </wp:inline>
-              </w:drawing>
-            </w:r>
-          </w:p>
-        </w:tc>
-        <w:tc>
-          <w:tcPr>
-            <w:tcW w:type="dxa" w:w="3528"/>
-            <w:tcBorders>
-              <w:top w:val="none" w:color="FFFFFF" w:sz="0"/>
-              <w:left w:val="none" w:color="FFFFFF" w:sz="0"/>
-              <w:bottom w:val="none" w:color="FFFFFF" w:sz="0"/>
-              <w:right w:val="none" w:color="FFFFFF" w:sz="0"/>
-            </w:tcBorders>
-            <w:tcMar>
-              <w:left w:type="dxa" w:w="503"/>
-              <w:right w:type="dxa" w:w="0"/>
-            </w:tcMar>
-            <w:vAlign w:val="bottom"/>
-          </w:tcPr>
-          <w:p>
-            <w:pPr>
-              <w:spacing w:after="0" w:line="264" w:lineRule="auto"/>
-            </w:pPr>
-            <w:r>
-              <w:rPr>
-                <w:rFonts w:ascii="Georgia" w:cs="Georgia" w:eastAsia="Georgia" w:hAnsi="Georgia"/>
-                <w:b/>
-                <w:bCs/>
-                <w:color w:val="163A47"/>
-                <w:sz w:val="17"/>
-                <w:szCs w:val="17"/>
-              </w:rPr>
-              <w:t xml:space="preserve">Katy Thomack, RN, MSN, CLNC</w:t>
-            </w:r>
-          </w:p>
-          <w:p>
-            <w:pPr>
-              <w:spacing w:after="0" w:line="264" w:lineRule="auto"/>
-            </w:pPr>
-            <w:r>
-              <w:rPr>
-                <w:rFonts w:ascii="Georgia" w:cs="Georgia" w:eastAsia="Georgia" w:hAnsi="Georgia"/>
-                <w:color w:val="1D2A30"/>
-                <w:sz w:val="17"/>
-                <w:szCs w:val="17"/>
-              </w:rPr>
-              <w:t xml:space="preserve">720-254-1359</w:t>
-            </w:r>
-          </w:p>
-          <w:p>
-            <w:pPr>
-              <w:spacing w:after="0" w:line="264" w:lineRule="auto"/>
-            </w:pPr>
-            <w:r>
-              <w:rPr>
-                <w:rFonts w:ascii="Georgia" w:cs="Georgia" w:eastAsia="Georgia" w:hAnsi="Georgia"/>
-                <w:color w:val="1D2A30"/>
-                <w:sz w:val="17"/>
-                <w:szCs w:val="17"/>
-              </w:rPr>
-              <w:t xml:space="preserve">katy@thomacklnc.com</w:t>
-            </w:r>
-          </w:p>
-          <w:p>
-            <w:pPr>
-              <w:spacing w:after="0" w:line="264" w:lineRule="auto"/>
-            </w:pPr>
-            <w:r>
-              <w:rPr>
-                <w:rFonts w:ascii="Georgia" w:cs="Georgia" w:eastAsia="Georgia" w:hAnsi="Georgia"/>
-                <w:color w:val="1D2A30"/>
-                <w:sz w:val="17"/>
-                <w:szCs w:val="17"/>
-              </w:rPr>
-              <w:t xml:space="preserve">thomacklnc.com</w:t>
-            </w:r>
-          </w:p>
-        </w:tc>
-      </w:tr>
-    </w:tbl>
-    <w:p>
-      <w:pPr>
-        <w:pBdr>
-          <w:bottom w:val="single" w:color="B08D57" w:sz="6" w:space="6"/>
-        </w:pBdr>
-        <w:spacing w:after="240" w:before="60"/>
-      </w:pPr>
+    <w:p>
+      <w:pPr>
+        <w:spacing w:after="360" w:before="0" w:line="240" w:lineRule="auto"/>
+      </w:pPr>
+      <w:r>
+        <w:drawing>
+          <wp:inline distT="0" distB="0" distL="0" distR="0">
+            <wp:extent cx="5943600" cy="904875"/>
+            <wp:effectExtent t="0" r="0" b="0" l="0"/>
+            <wp:docPr id="1" name="letterhead" descr="Logo and contact information" title="Thomack Legal Nurse Consulting letterhead"/>
+            <wp:cNvGraphicFramePr>
+              <a:graphicFrameLocks xmlns:a="http://schemas.openxmlformats.org/drawingml/2006/main" noChangeAspect="1"/>
+            </wp:cNvGraphicFramePr>
+            <a:graphic xmlns:a="http://schemas.openxmlformats.org/drawingml/2006/main">
+              <a:graphicData uri="http://schemas.openxmlformats.org/drawingml/2006/picture">
+                <pic:pic xmlns:pic="http://schemas.openxmlformats.org/drawingml/2006/picture">
+                  <pic:nvPicPr>
+                    <pic:cNvPr id="0" name="" descr=""/>
+                    <pic:cNvPicPr>
+                      <a:picLocks noChangeAspect="1" noChangeArrowheads="1"/>
+                    </pic:cNvPicPr>
+                  </pic:nvPicPr>
+                  <pic:blipFill>
+                    <a:blip r:embed="rId9" cstate="none"/>
+                    <a:srcRect/>
+                    <a:stretch>
+                      <a:fillRect/>
+                    </a:stretch>
+                  </pic:blipFill>
+                  <pic:spPr bwMode="auto">
+                    <a:xfrm>
+                      <a:off x="0" y="0"/>
+                      <a:ext cx="5943600" cy="904875"/>
+                    </a:xfrm>
+                    <a:prstGeom prst="rect">
+                      <a:avLst/>
+                    </a:prstGeom>
+                  </pic:spPr>
+                </pic:pic>
+              </a:graphicData>
+            </a:graphic>
+          </wp:inline>
+        </w:drawing>
+      </w:r>
     </w:p>
     <w:p>
       <w:pPr>

</xml_diff>

<commit_message>
Letterhead (Pages): tighter top, space under rule, explicit line spacing
- Crop extra white space from the header image and lower the top margin
  so the letterhead starts higher on the page.
- Use a real empty line after the image; Pages ignores space-after there.
- Set 1.15 line spacing on each body paragraph so Pages keeps it.

Co-Authored-By: Claude Opus 5.5 <noreply@anthropic.com>
Claude-Session: https://claude.ai/code/session_012i8wR9qeLtNBrvBzFpQnCL
</commit_message>
<xml_diff>
--- a/print/letterhead/thomack-letterhead-pages.docx
+++ b/print/letterhead/thomack-letterhead-pages.docx
@@ -4,12 +4,12 @@
   <w:body>
     <w:p>
       <w:pPr>
-        <w:spacing w:after="360" w:before="0" w:line="240" w:lineRule="auto"/>
+        <w:spacing w:after="0" w:before="0" w:line="240" w:lineRule="auto"/>
       </w:pPr>
       <w:r>
         <w:drawing>
           <wp:inline distT="0" distB="0" distL="0" distR="0">
-            <wp:extent cx="5943600" cy="904875"/>
+            <wp:extent cx="5943600" cy="771525"/>
             <wp:effectExtent t="0" r="0" b="0" l="0"/>
             <wp:docPr id="1" name="letterhead" descr="Logo and contact information" title="Thomack Legal Nurse Consulting letterhead"/>
             <wp:cNvGraphicFramePr>
@@ -34,7 +34,7 @@
                   <pic:spPr bwMode="auto">
                     <a:xfrm>
                       <a:off x="0" y="0"/>
-                      <a:ext cx="5943600" cy="904875"/>
+                      <a:ext cx="5943600" cy="771525"/>
                     </a:xfrm>
                     <a:prstGeom prst="rect">
                       <a:avLst/>
@@ -49,7 +49,12 @@
     </w:p>
     <w:p>
       <w:pPr>
-        <w:spacing w:after="0"/>
+        <w:spacing w:after="0" w:line="276" w:lineRule="auto"/>
+      </w:pPr>
+    </w:p>
+    <w:p>
+      <w:pPr>
+        <w:spacing w:after="0" w:line="276" w:lineRule="auto"/>
       </w:pPr>
       <w:r>
         <w:rPr>
@@ -61,12 +66,12 @@
     </w:p>
     <w:p>
       <w:pPr>
-        <w:spacing w:after="0"/>
-      </w:pPr>
-    </w:p>
-    <w:p>
-      <w:pPr>
-        <w:spacing w:after="0"/>
+        <w:spacing w:after="0" w:line="276" w:lineRule="auto"/>
+      </w:pPr>
+    </w:p>
+    <w:p>
+      <w:pPr>
+        <w:spacing w:after="0" w:line="276" w:lineRule="auto"/>
       </w:pPr>
       <w:r>
         <w:rPr>
@@ -78,7 +83,7 @@
     </w:p>
     <w:p>
       <w:pPr>
-        <w:spacing w:after="0"/>
+        <w:spacing w:after="0" w:line="276" w:lineRule="auto"/>
       </w:pPr>
       <w:r>
         <w:rPr>
@@ -90,7 +95,7 @@
     </w:p>
     <w:p>
       <w:pPr>
-        <w:spacing w:after="0"/>
+        <w:spacing w:after="0" w:line="276" w:lineRule="auto"/>
       </w:pPr>
       <w:r>
         <w:rPr>
@@ -102,7 +107,7 @@
     </w:p>
     <w:p>
       <w:pPr>
-        <w:spacing w:after="0"/>
+        <w:spacing w:after="0" w:line="276" w:lineRule="auto"/>
       </w:pPr>
       <w:r>
         <w:rPr>
@@ -114,7 +119,7 @@
     </w:p>
     <w:p>
       <w:pPr>
-        <w:spacing w:after="0"/>
+        <w:spacing w:after="0" w:line="276" w:lineRule="auto"/>
       </w:pPr>
     </w:p>
     <w:p>
@@ -122,7 +127,7 @@
         <w:tabs>
           <w:tab w:val="left" w:pos="720"/>
         </w:tabs>
-        <w:spacing w:after="0"/>
+        <w:spacing w:after="0" w:line="276" w:lineRule="auto"/>
       </w:pPr>
       <w:r>
         <w:rPr>
@@ -143,12 +148,12 @@
     </w:p>
     <w:p>
       <w:pPr>
-        <w:spacing w:after="0"/>
-      </w:pPr>
-    </w:p>
-    <w:p>
-      <w:pPr>
-        <w:spacing w:after="0"/>
+        <w:spacing w:after="0" w:line="276" w:lineRule="auto"/>
+      </w:pPr>
+    </w:p>
+    <w:p>
+      <w:pPr>
+        <w:spacing w:after="0" w:line="276" w:lineRule="auto"/>
       </w:pPr>
       <w:r>
         <w:rPr>
@@ -160,12 +165,12 @@
     </w:p>
     <w:p>
       <w:pPr>
-        <w:spacing w:after="0"/>
-      </w:pPr>
-    </w:p>
-    <w:p>
-      <w:pPr>
-        <w:spacing w:after="0"/>
+        <w:spacing w:after="0" w:line="276" w:lineRule="auto"/>
+      </w:pPr>
+    </w:p>
+    <w:p>
+      <w:pPr>
+        <w:spacing w:after="0" w:line="276" w:lineRule="auto"/>
       </w:pPr>
       <w:r>
         <w:rPr>
@@ -177,12 +182,12 @@
     </w:p>
     <w:p>
       <w:pPr>
-        <w:spacing w:after="0"/>
-      </w:pPr>
-    </w:p>
-    <w:p>
-      <w:pPr>
-        <w:spacing w:after="0"/>
+        <w:spacing w:after="0" w:line="276" w:lineRule="auto"/>
+      </w:pPr>
+    </w:p>
+    <w:p>
+      <w:pPr>
+        <w:spacing w:after="0" w:line="276" w:lineRule="auto"/>
       </w:pPr>
       <w:r>
         <w:rPr>
@@ -194,22 +199,22 @@
     </w:p>
     <w:p>
       <w:pPr>
-        <w:spacing w:after="0"/>
-      </w:pPr>
-    </w:p>
-    <w:p>
-      <w:pPr>
-        <w:spacing w:after="0"/>
-      </w:pPr>
-    </w:p>
-    <w:p>
-      <w:pPr>
-        <w:spacing w:after="0"/>
-      </w:pPr>
-    </w:p>
-    <w:p>
-      <w:pPr>
-        <w:spacing w:after="0"/>
+        <w:spacing w:after="0" w:line="276" w:lineRule="auto"/>
+      </w:pPr>
+    </w:p>
+    <w:p>
+      <w:pPr>
+        <w:spacing w:after="0" w:line="276" w:lineRule="auto"/>
+      </w:pPr>
+    </w:p>
+    <w:p>
+      <w:pPr>
+        <w:spacing w:after="0" w:line="276" w:lineRule="auto"/>
+      </w:pPr>
+    </w:p>
+    <w:p>
+      <w:pPr>
+        <w:spacing w:after="0" w:line="276" w:lineRule="auto"/>
       </w:pPr>
       <w:r>
         <w:rPr>
@@ -221,7 +226,7 @@
     </w:p>
     <w:p>
       <w:pPr>
-        <w:spacing w:after="0"/>
+        <w:spacing w:after="0" w:line="276" w:lineRule="auto"/>
       </w:pPr>
       <w:r>
         <w:rPr>
@@ -235,7 +240,7 @@
       <w:headerReference w:type="default" r:id="rId7"/>
       <w:footerReference w:type="default" r:id="rId8"/>
       <w:pgSz w:w="12240" w:h="15840" w:orient="portrait"/>
-      <w:pgMar w:top="1224" w:right="1440" w:bottom="1224" w:left="1440" w:header="648" w:footer="648" w:gutter="0"/>
+      <w:pgMar w:top="864" w:right="1440" w:bottom="1224" w:left="1440" w:header="503" w:footer="648" w:gutter="0"/>
       <w:pgNumType/>
       <w:docGrid w:linePitch="360"/>
     </w:sectPr>
@@ -353,7 +358,7 @@
       <w:tabs>
         <w:tab w:val="right" w:pos="9360"/>
       </w:tabs>
-      <w:spacing w:after="360"/>
+      <w:spacing w:after="120"/>
     </w:pPr>
     <w:r>
       <w:rPr>

</xml_diff>